<commit_message>
mini project mean_normalizationa and separation
</commit_message>
<xml_diff>
--- a/project_using_a_pretrained_img_clasifier_to_identify_dog_breeds/Image Classification for a City Dog Show.docx
+++ b/project_using_a_pretrained_img_clasifier_to_identify_dog_breeds/Image Classification for a City Dog Show.docx
@@ -232,23 +232,7 @@
         </w:numPr>
       </w:pPr>
       <w:r>
-        <w:t>Determine which CNN model architecture (</w:t>
-      </w:r>
-      <w:proofErr w:type="spellStart"/>
-      <w:r>
-        <w:t>ResNet</w:t>
-      </w:r>
-      <w:proofErr w:type="spellEnd"/>
-      <w:r>
-        <w:t xml:space="preserve">, </w:t>
-      </w:r>
-      <w:proofErr w:type="spellStart"/>
-      <w:r>
-        <w:t>AlexNet</w:t>
-      </w:r>
-      <w:proofErr w:type="spellEnd"/>
-      <w:r>
-        <w:t>, or VGG), "</w:t>
+        <w:t>Determine which CNN model architecture (ResNet, AlexNet, or VGG), "</w:t>
       </w:r>
       <w:r>
         <w:rPr>
@@ -487,7 +471,6 @@
         </w:rPr>
         <w:t> is the program file that you will be editing to achieve the four objectives above. This file contains a </w:t>
       </w:r>
-      <w:proofErr w:type="gramStart"/>
       <w:r>
         <w:rPr>
           <w:rFonts w:ascii="Fira Code" w:eastAsia="Times New Roman" w:hAnsi="Fira Code" w:cs="Fira Code"/>
@@ -498,20 +481,7 @@
           <w:bdr w:val="single" w:sz="2" w:space="3" w:color="DFDFDF" w:frame="1"/>
           <w14:ligatures w14:val="none"/>
         </w:rPr>
-        <w:t>main(</w:t>
-      </w:r>
-      <w:proofErr w:type="gramEnd"/>
-      <w:r>
-        <w:rPr>
-          <w:rFonts w:ascii="Fira Code" w:eastAsia="Times New Roman" w:hAnsi="Fira Code" w:cs="Fira Code"/>
-          <w:color w:val="0B0B0B"/>
-          <w:kern w:val="0"/>
-          <w:sz w:val="21"/>
-          <w:szCs w:val="21"/>
-          <w:bdr w:val="single" w:sz="2" w:space="3" w:color="DFDFDF" w:frame="1"/>
-          <w14:ligatures w14:val="none"/>
-        </w:rPr>
-        <w:t>)</w:t>
+        <w:t>main()</w:t>
       </w:r>
       <w:r>
         <w:rPr>
@@ -791,15 +761,7 @@
         <w:t>check_images.py</w:t>
       </w:r>
       <w:r>
-        <w:t> is the program file that you will be editing to achieve the four objectives above. This file contains a </w:t>
-      </w:r>
-      <w:proofErr w:type="gramStart"/>
-      <w:r>
-        <w:t>main(</w:t>
-      </w:r>
-      <w:proofErr w:type="gramEnd"/>
-      <w:r>
-        <w:t>) function that outlines how to complete this program through using functions that have </w:t>
+        <w:t> is the program file that you will be editing to achieve the four objectives above. This file contains a main() function that outlines how to complete this program through using functions that have </w:t>
       </w:r>
       <w:r>
         <w:rPr>
@@ -878,15 +840,7 @@
         <w:t>Project Workspace</w:t>
       </w:r>
       <w:r>
-        <w:t xml:space="preserve"> is set up with the programs and files (like </w:t>
-      </w:r>
-      <w:proofErr w:type="spellStart"/>
-      <w:r>
-        <w:t>pet_images</w:t>
-      </w:r>
-      <w:proofErr w:type="spellEnd"/>
-      <w:r>
-        <w:t xml:space="preserve"> folder) you will need to complete the project.</w:t>
+        <w:t> is set up with the programs and files (like pet_images folder) you will need to complete the project.</w:t>
       </w:r>
     </w:p>
     <w:p>
@@ -1057,15 +1011,7 @@
         </w:numPr>
       </w:pPr>
       <w:r>
-        <w:t xml:space="preserve">Details about the assignment's files (e.g. image files in </w:t>
-      </w:r>
-      <w:proofErr w:type="spellStart"/>
-      <w:r>
-        <w:t>pet_images</w:t>
-      </w:r>
-      <w:proofErr w:type="spellEnd"/>
-      <w:r>
-        <w:t xml:space="preserve"> folder, dognames.txt).</w:t>
+        <w:t>Details about the assignment's files (e.g. image files in pet_images folder, dognames.txt).</w:t>
       </w:r>
     </w:p>
     <w:p>
@@ -1383,6 +1329,1275 @@
         <w:t>You will need to repeat these tasks for each of the three image classification algorithms that are provided to you.</w:t>
       </w:r>
     </w:p>
+    <w:p>
+      <w:r>
+        <w:t>Use this project rubric to understand and assess the project criteria.</w:t>
+      </w:r>
+    </w:p>
+    <w:p>
+      <w:r>
+        <w:t>Timing Code</w:t>
+      </w:r>
+    </w:p>
+    <w:tbl>
+      <w:tblPr>
+        <w:tblW w:w="5000" w:type="pct"/>
+        <w:tblBorders>
+          <w:top w:val="single" w:sz="6" w:space="0" w:color="DFDFDF"/>
+          <w:left w:val="single" w:sz="6" w:space="0" w:color="DFDFDF"/>
+          <w:bottom w:val="single" w:sz="6" w:space="0" w:color="DFDFDF"/>
+          <w:right w:val="single" w:sz="6" w:space="0" w:color="DFDFDF"/>
+        </w:tblBorders>
+        <w:tblCellMar>
+          <w:top w:w="15" w:type="dxa"/>
+          <w:left w:w="15" w:type="dxa"/>
+          <w:bottom w:w="15" w:type="dxa"/>
+          <w:right w:w="15" w:type="dxa"/>
+        </w:tblCellMar>
+        <w:tblLook w:val="04A0" w:firstRow="1" w:lastRow="0" w:firstColumn="1" w:lastColumn="0" w:noHBand="0" w:noVBand="1"/>
+      </w:tblPr>
+      <w:tblGrid>
+        <w:gridCol w:w="4670"/>
+        <w:gridCol w:w="4690"/>
+      </w:tblGrid>
+      <w:tr>
+        <w:trPr>
+          <w:tblHeader/>
+        </w:trPr>
+        <w:tc>
+          <w:tcPr>
+            <w:tcW w:w="8993" w:type="dxa"/>
+            <w:tcBorders>
+              <w:top w:val="nil"/>
+              <w:left w:val="nil"/>
+              <w:bottom w:val="nil"/>
+              <w:right w:val="single" w:sz="6" w:space="0" w:color="DFDFDF"/>
+            </w:tcBorders>
+            <w:shd w:val="clear" w:color="auto" w:fill="F0F5FF"/>
+            <w:tcMar>
+              <w:top w:w="210" w:type="dxa"/>
+              <w:left w:w="210" w:type="dxa"/>
+              <w:bottom w:w="210" w:type="dxa"/>
+              <w:right w:w="210" w:type="dxa"/>
+            </w:tcMar>
+            <w:vAlign w:val="center"/>
+            <w:hideMark/>
+          </w:tcPr>
+          <w:p>
+            <w:pPr>
+              <w:rPr>
+                <w:b/>
+                <w:bCs/>
+              </w:rPr>
+            </w:pPr>
+            <w:r>
+              <w:rPr>
+                <w:b/>
+                <w:bCs/>
+              </w:rPr>
+              <w:t>Criteria</w:t>
+            </w:r>
+          </w:p>
+        </w:tc>
+        <w:tc>
+          <w:tcPr>
+            <w:tcW w:w="8993" w:type="dxa"/>
+            <w:tcBorders>
+              <w:top w:val="nil"/>
+              <w:left w:val="nil"/>
+              <w:bottom w:val="nil"/>
+              <w:right w:val="nil"/>
+            </w:tcBorders>
+            <w:shd w:val="clear" w:color="auto" w:fill="F0F5FF"/>
+            <w:tcMar>
+              <w:top w:w="210" w:type="dxa"/>
+              <w:left w:w="210" w:type="dxa"/>
+              <w:bottom w:w="210" w:type="dxa"/>
+              <w:right w:w="210" w:type="dxa"/>
+            </w:tcMar>
+            <w:vAlign w:val="center"/>
+            <w:hideMark/>
+          </w:tcPr>
+          <w:p>
+            <w:pPr>
+              <w:rPr>
+                <w:b/>
+                <w:bCs/>
+              </w:rPr>
+            </w:pPr>
+            <w:r>
+              <w:rPr>
+                <w:b/>
+                <w:bCs/>
+              </w:rPr>
+              <w:t>Submission Requirements</w:t>
+            </w:r>
+          </w:p>
+        </w:tc>
+      </w:tr>
+      <w:tr>
+        <w:tc>
+          <w:tcPr>
+            <w:tcW w:w="8993" w:type="dxa"/>
+            <w:tcBorders>
+              <w:top w:val="single" w:sz="2" w:space="0" w:color="DFDFDF"/>
+              <w:left w:val="single" w:sz="2" w:space="0" w:color="DFDFDF"/>
+              <w:bottom w:val="single" w:sz="4" w:space="0" w:color="DFDFDF"/>
+              <w:right w:val="single" w:sz="6" w:space="0" w:color="DFDFDF"/>
+            </w:tcBorders>
+            <w:shd w:val="clear" w:color="auto" w:fill="FFFFFF"/>
+            <w:tcMar>
+              <w:top w:w="210" w:type="dxa"/>
+              <w:left w:w="210" w:type="dxa"/>
+              <w:bottom w:w="210" w:type="dxa"/>
+              <w:right w:w="210" w:type="dxa"/>
+            </w:tcMar>
+            <w:vAlign w:val="center"/>
+            <w:hideMark/>
+          </w:tcPr>
+          <w:p>
+            <w:r>
+              <w:t>Implementing Time functions.</w:t>
+            </w:r>
+          </w:p>
+        </w:tc>
+        <w:tc>
+          <w:tcPr>
+            <w:tcW w:w="8993" w:type="dxa"/>
+            <w:tcBorders>
+              <w:top w:val="single" w:sz="2" w:space="0" w:color="DFDFDF"/>
+              <w:left w:val="single" w:sz="2" w:space="0" w:color="DFDFDF"/>
+              <w:bottom w:val="single" w:sz="4" w:space="0" w:color="DFDFDF"/>
+              <w:right w:val="single" w:sz="2" w:space="0" w:color="DFDFDF"/>
+            </w:tcBorders>
+            <w:shd w:val="clear" w:color="auto" w:fill="FFFFFF"/>
+            <w:tcMar>
+              <w:top w:w="210" w:type="dxa"/>
+              <w:left w:w="210" w:type="dxa"/>
+              <w:bottom w:w="210" w:type="dxa"/>
+              <w:right w:w="210" w:type="dxa"/>
+            </w:tcMar>
+            <w:vAlign w:val="center"/>
+            <w:hideMark/>
+          </w:tcPr>
+          <w:p>
+            <w:r>
+              <w:t>Student calls the time functions before the start of main code and after the main logic has been finished.</w:t>
+            </w:r>
+          </w:p>
+        </w:tc>
+      </w:tr>
+    </w:tbl>
+    <w:p>
+      <w:r>
+        <w:t>Command Line Arguments</w:t>
+      </w:r>
+    </w:p>
+    <w:tbl>
+      <w:tblPr>
+        <w:tblW w:w="5000" w:type="pct"/>
+        <w:tblBorders>
+          <w:top w:val="single" w:sz="6" w:space="0" w:color="DFDFDF"/>
+          <w:left w:val="single" w:sz="6" w:space="0" w:color="DFDFDF"/>
+          <w:bottom w:val="single" w:sz="6" w:space="0" w:color="DFDFDF"/>
+          <w:right w:val="single" w:sz="6" w:space="0" w:color="DFDFDF"/>
+        </w:tblBorders>
+        <w:tblCellMar>
+          <w:top w:w="15" w:type="dxa"/>
+          <w:left w:w="15" w:type="dxa"/>
+          <w:bottom w:w="15" w:type="dxa"/>
+          <w:right w:w="15" w:type="dxa"/>
+        </w:tblCellMar>
+        <w:tblLook w:val="04A0" w:firstRow="1" w:lastRow="0" w:firstColumn="1" w:lastColumn="0" w:noHBand="0" w:noVBand="1"/>
+      </w:tblPr>
+      <w:tblGrid>
+        <w:gridCol w:w="4279"/>
+        <w:gridCol w:w="5081"/>
+      </w:tblGrid>
+      <w:tr>
+        <w:trPr>
+          <w:tblHeader/>
+        </w:trPr>
+        <w:tc>
+          <w:tcPr>
+            <w:tcW w:w="8993" w:type="dxa"/>
+            <w:tcBorders>
+              <w:top w:val="nil"/>
+              <w:left w:val="nil"/>
+              <w:bottom w:val="nil"/>
+              <w:right w:val="single" w:sz="6" w:space="0" w:color="DFDFDF"/>
+            </w:tcBorders>
+            <w:shd w:val="clear" w:color="auto" w:fill="F0F5FF"/>
+            <w:tcMar>
+              <w:top w:w="210" w:type="dxa"/>
+              <w:left w:w="210" w:type="dxa"/>
+              <w:bottom w:w="210" w:type="dxa"/>
+              <w:right w:w="210" w:type="dxa"/>
+            </w:tcMar>
+            <w:vAlign w:val="center"/>
+            <w:hideMark/>
+          </w:tcPr>
+          <w:p>
+            <w:pPr>
+              <w:rPr>
+                <w:b/>
+                <w:bCs/>
+              </w:rPr>
+            </w:pPr>
+            <w:r>
+              <w:rPr>
+                <w:b/>
+                <w:bCs/>
+              </w:rPr>
+              <w:lastRenderedPageBreak/>
+              <w:t>Criteria</w:t>
+            </w:r>
+          </w:p>
+        </w:tc>
+        <w:tc>
+          <w:tcPr>
+            <w:tcW w:w="8993" w:type="dxa"/>
+            <w:tcBorders>
+              <w:top w:val="nil"/>
+              <w:left w:val="nil"/>
+              <w:bottom w:val="nil"/>
+              <w:right w:val="nil"/>
+            </w:tcBorders>
+            <w:shd w:val="clear" w:color="auto" w:fill="F0F5FF"/>
+            <w:tcMar>
+              <w:top w:w="210" w:type="dxa"/>
+              <w:left w:w="210" w:type="dxa"/>
+              <w:bottom w:w="210" w:type="dxa"/>
+              <w:right w:w="210" w:type="dxa"/>
+            </w:tcMar>
+            <w:vAlign w:val="center"/>
+            <w:hideMark/>
+          </w:tcPr>
+          <w:p>
+            <w:pPr>
+              <w:rPr>
+                <w:b/>
+                <w:bCs/>
+              </w:rPr>
+            </w:pPr>
+            <w:r>
+              <w:rPr>
+                <w:b/>
+                <w:bCs/>
+              </w:rPr>
+              <w:t>Submission Requirements</w:t>
+            </w:r>
+          </w:p>
+        </w:tc>
+      </w:tr>
+      <w:tr>
+        <w:tc>
+          <w:tcPr>
+            <w:tcW w:w="8993" w:type="dxa"/>
+            <w:tcBorders>
+              <w:top w:val="single" w:sz="2" w:space="0" w:color="DFDFDF"/>
+              <w:left w:val="single" w:sz="2" w:space="0" w:color="DFDFDF"/>
+              <w:bottom w:val="single" w:sz="4" w:space="0" w:color="DFDFDF"/>
+              <w:right w:val="single" w:sz="6" w:space="0" w:color="DFDFDF"/>
+            </w:tcBorders>
+            <w:shd w:val="clear" w:color="auto" w:fill="FFFFFF"/>
+            <w:tcMar>
+              <w:top w:w="210" w:type="dxa"/>
+              <w:left w:w="210" w:type="dxa"/>
+              <w:bottom w:w="210" w:type="dxa"/>
+              <w:right w:w="210" w:type="dxa"/>
+            </w:tcMar>
+            <w:vAlign w:val="center"/>
+            <w:hideMark/>
+          </w:tcPr>
+          <w:p>
+            <w:r>
+              <w:rPr>
+                <w:b/>
+                <w:bCs/>
+              </w:rPr>
+              <w:t>Question 1</w:t>
+            </w:r>
+            <w:r>
+              <w:t> Enable dir argument</w:t>
+            </w:r>
+          </w:p>
+        </w:tc>
+        <w:tc>
+          <w:tcPr>
+            <w:tcW w:w="8993" w:type="dxa"/>
+            <w:tcBorders>
+              <w:top w:val="single" w:sz="2" w:space="0" w:color="DFDFDF"/>
+              <w:left w:val="single" w:sz="2" w:space="0" w:color="DFDFDF"/>
+              <w:bottom w:val="single" w:sz="4" w:space="0" w:color="DFDFDF"/>
+              <w:right w:val="single" w:sz="2" w:space="0" w:color="DFDFDF"/>
+            </w:tcBorders>
+            <w:shd w:val="clear" w:color="auto" w:fill="FFFFFF"/>
+            <w:tcMar>
+              <w:top w:w="210" w:type="dxa"/>
+              <w:left w:w="210" w:type="dxa"/>
+              <w:bottom w:w="210" w:type="dxa"/>
+              <w:right w:w="210" w:type="dxa"/>
+            </w:tcMar>
+            <w:vAlign w:val="center"/>
+            <w:hideMark/>
+          </w:tcPr>
+          <w:p>
+            <w:r>
+              <w:t>adds command line argument for '--dir' uses default ='pet_images/'</w:t>
+            </w:r>
+          </w:p>
+        </w:tc>
+      </w:tr>
+      <w:tr>
+        <w:tc>
+          <w:tcPr>
+            <w:tcW w:w="8993" w:type="dxa"/>
+            <w:tcBorders>
+              <w:top w:val="single" w:sz="2" w:space="0" w:color="DFDFDF"/>
+              <w:left w:val="single" w:sz="2" w:space="0" w:color="DFDFDF"/>
+              <w:bottom w:val="single" w:sz="4" w:space="0" w:color="DFDFDF"/>
+              <w:right w:val="single" w:sz="6" w:space="0" w:color="DFDFDF"/>
+            </w:tcBorders>
+            <w:shd w:val="clear" w:color="auto" w:fill="FFFFFF"/>
+            <w:tcMar>
+              <w:top w:w="210" w:type="dxa"/>
+              <w:left w:w="210" w:type="dxa"/>
+              <w:bottom w:w="210" w:type="dxa"/>
+              <w:right w:w="210" w:type="dxa"/>
+            </w:tcMar>
+            <w:vAlign w:val="center"/>
+            <w:hideMark/>
+          </w:tcPr>
+          <w:p>
+            <w:r>
+              <w:rPr>
+                <w:b/>
+                <w:bCs/>
+              </w:rPr>
+              <w:t>Question 2</w:t>
+            </w:r>
+            <w:r>
+              <w:t> Enable arch argument</w:t>
+            </w:r>
+          </w:p>
+        </w:tc>
+        <w:tc>
+          <w:tcPr>
+            <w:tcW w:w="8993" w:type="dxa"/>
+            <w:tcBorders>
+              <w:top w:val="single" w:sz="2" w:space="0" w:color="DFDFDF"/>
+              <w:left w:val="single" w:sz="2" w:space="0" w:color="DFDFDF"/>
+              <w:bottom w:val="single" w:sz="4" w:space="0" w:color="DFDFDF"/>
+              <w:right w:val="single" w:sz="2" w:space="0" w:color="DFDFDF"/>
+            </w:tcBorders>
+            <w:shd w:val="clear" w:color="auto" w:fill="FFFFFF"/>
+            <w:tcMar>
+              <w:top w:w="210" w:type="dxa"/>
+              <w:left w:w="210" w:type="dxa"/>
+              <w:bottom w:w="210" w:type="dxa"/>
+              <w:right w:w="210" w:type="dxa"/>
+            </w:tcMar>
+            <w:vAlign w:val="center"/>
+            <w:hideMark/>
+          </w:tcPr>
+          <w:p>
+            <w:r>
+              <w:t>adds command line argument for '--arch' default='vgg'</w:t>
+            </w:r>
+          </w:p>
+        </w:tc>
+      </w:tr>
+      <w:tr>
+        <w:tc>
+          <w:tcPr>
+            <w:tcW w:w="8993" w:type="dxa"/>
+            <w:tcBorders>
+              <w:top w:val="single" w:sz="2" w:space="0" w:color="DFDFDF"/>
+              <w:left w:val="single" w:sz="2" w:space="0" w:color="DFDFDF"/>
+              <w:bottom w:val="single" w:sz="4" w:space="0" w:color="DFDFDF"/>
+              <w:right w:val="single" w:sz="6" w:space="0" w:color="DFDFDF"/>
+            </w:tcBorders>
+            <w:shd w:val="clear" w:color="auto" w:fill="FFFFFF"/>
+            <w:tcMar>
+              <w:top w:w="210" w:type="dxa"/>
+              <w:left w:w="210" w:type="dxa"/>
+              <w:bottom w:w="210" w:type="dxa"/>
+              <w:right w:w="210" w:type="dxa"/>
+            </w:tcMar>
+            <w:vAlign w:val="center"/>
+            <w:hideMark/>
+          </w:tcPr>
+          <w:p>
+            <w:r>
+              <w:rPr>
+                <w:b/>
+                <w:bCs/>
+              </w:rPr>
+              <w:t>Question 3</w:t>
+            </w:r>
+            <w:r>
+              <w:t> Enable dogfile argument</w:t>
+            </w:r>
+          </w:p>
+        </w:tc>
+        <w:tc>
+          <w:tcPr>
+            <w:tcW w:w="8993" w:type="dxa"/>
+            <w:tcBorders>
+              <w:top w:val="single" w:sz="2" w:space="0" w:color="DFDFDF"/>
+              <w:left w:val="single" w:sz="2" w:space="0" w:color="DFDFDF"/>
+              <w:bottom w:val="single" w:sz="4" w:space="0" w:color="DFDFDF"/>
+              <w:right w:val="single" w:sz="2" w:space="0" w:color="DFDFDF"/>
+            </w:tcBorders>
+            <w:shd w:val="clear" w:color="auto" w:fill="FFFFFF"/>
+            <w:tcMar>
+              <w:top w:w="210" w:type="dxa"/>
+              <w:left w:w="210" w:type="dxa"/>
+              <w:bottom w:w="210" w:type="dxa"/>
+              <w:right w:w="210" w:type="dxa"/>
+            </w:tcMar>
+            <w:vAlign w:val="center"/>
+            <w:hideMark/>
+          </w:tcPr>
+          <w:p>
+            <w:r>
+              <w:t>adds command line argument for '--dogfile' default='dognames.txt'</w:t>
+            </w:r>
+          </w:p>
+        </w:tc>
+      </w:tr>
+    </w:tbl>
+    <w:p>
+      <w:r>
+        <w:t>Pet Image Labels</w:t>
+      </w:r>
+    </w:p>
+    <w:tbl>
+      <w:tblPr>
+        <w:tblW w:w="5000" w:type="pct"/>
+        <w:tblBorders>
+          <w:top w:val="single" w:sz="6" w:space="0" w:color="DFDFDF"/>
+          <w:left w:val="single" w:sz="6" w:space="0" w:color="DFDFDF"/>
+          <w:bottom w:val="single" w:sz="6" w:space="0" w:color="DFDFDF"/>
+          <w:right w:val="single" w:sz="6" w:space="0" w:color="DFDFDF"/>
+        </w:tblBorders>
+        <w:tblCellMar>
+          <w:top w:w="15" w:type="dxa"/>
+          <w:left w:w="15" w:type="dxa"/>
+          <w:bottom w:w="15" w:type="dxa"/>
+          <w:right w:w="15" w:type="dxa"/>
+        </w:tblCellMar>
+        <w:tblLook w:val="04A0" w:firstRow="1" w:lastRow="0" w:firstColumn="1" w:lastColumn="0" w:noHBand="0" w:noVBand="1"/>
+      </w:tblPr>
+      <w:tblGrid>
+        <w:gridCol w:w="4361"/>
+        <w:gridCol w:w="4999"/>
+      </w:tblGrid>
+      <w:tr>
+        <w:trPr>
+          <w:tblHeader/>
+        </w:trPr>
+        <w:tc>
+          <w:tcPr>
+            <w:tcW w:w="8993" w:type="dxa"/>
+            <w:tcBorders>
+              <w:top w:val="nil"/>
+              <w:left w:val="nil"/>
+              <w:bottom w:val="nil"/>
+              <w:right w:val="single" w:sz="6" w:space="0" w:color="DFDFDF"/>
+            </w:tcBorders>
+            <w:shd w:val="clear" w:color="auto" w:fill="F0F5FF"/>
+            <w:tcMar>
+              <w:top w:w="210" w:type="dxa"/>
+              <w:left w:w="210" w:type="dxa"/>
+              <w:bottom w:w="210" w:type="dxa"/>
+              <w:right w:w="210" w:type="dxa"/>
+            </w:tcMar>
+            <w:vAlign w:val="center"/>
+            <w:hideMark/>
+          </w:tcPr>
+          <w:p>
+            <w:pPr>
+              <w:rPr>
+                <w:b/>
+                <w:bCs/>
+              </w:rPr>
+            </w:pPr>
+            <w:r>
+              <w:rPr>
+                <w:b/>
+                <w:bCs/>
+              </w:rPr>
+              <w:t>Criteria</w:t>
+            </w:r>
+          </w:p>
+        </w:tc>
+        <w:tc>
+          <w:tcPr>
+            <w:tcW w:w="8993" w:type="dxa"/>
+            <w:tcBorders>
+              <w:top w:val="nil"/>
+              <w:left w:val="nil"/>
+              <w:bottom w:val="nil"/>
+              <w:right w:val="nil"/>
+            </w:tcBorders>
+            <w:shd w:val="clear" w:color="auto" w:fill="F0F5FF"/>
+            <w:tcMar>
+              <w:top w:w="210" w:type="dxa"/>
+              <w:left w:w="210" w:type="dxa"/>
+              <w:bottom w:w="210" w:type="dxa"/>
+              <w:right w:w="210" w:type="dxa"/>
+            </w:tcMar>
+            <w:vAlign w:val="center"/>
+            <w:hideMark/>
+          </w:tcPr>
+          <w:p>
+            <w:pPr>
+              <w:rPr>
+                <w:b/>
+                <w:bCs/>
+              </w:rPr>
+            </w:pPr>
+            <w:r>
+              <w:rPr>
+                <w:b/>
+                <w:bCs/>
+              </w:rPr>
+              <w:t>Submission Requirements</w:t>
+            </w:r>
+          </w:p>
+        </w:tc>
+      </w:tr>
+      <w:tr>
+        <w:tc>
+          <w:tcPr>
+            <w:tcW w:w="8993" w:type="dxa"/>
+            <w:tcBorders>
+              <w:top w:val="single" w:sz="2" w:space="0" w:color="DFDFDF"/>
+              <w:left w:val="single" w:sz="2" w:space="0" w:color="DFDFDF"/>
+              <w:bottom w:val="single" w:sz="4" w:space="0" w:color="DFDFDF"/>
+              <w:right w:val="single" w:sz="6" w:space="0" w:color="DFDFDF"/>
+            </w:tcBorders>
+            <w:shd w:val="clear" w:color="auto" w:fill="FFFFFF"/>
+            <w:tcMar>
+              <w:top w:w="210" w:type="dxa"/>
+              <w:left w:w="210" w:type="dxa"/>
+              <w:bottom w:w="210" w:type="dxa"/>
+              <w:right w:w="210" w:type="dxa"/>
+            </w:tcMar>
+            <w:vAlign w:val="center"/>
+            <w:hideMark/>
+          </w:tcPr>
+          <w:p>
+            <w:r>
+              <w:t>Dictionary returned is in the correct format.</w:t>
+            </w:r>
+          </w:p>
+        </w:tc>
+        <w:tc>
+          <w:tcPr>
+            <w:tcW w:w="8993" w:type="dxa"/>
+            <w:tcBorders>
+              <w:top w:val="single" w:sz="2" w:space="0" w:color="DFDFDF"/>
+              <w:left w:val="single" w:sz="2" w:space="0" w:color="DFDFDF"/>
+              <w:bottom w:val="single" w:sz="4" w:space="0" w:color="DFDFDF"/>
+              <w:right w:val="single" w:sz="2" w:space="0" w:color="DFDFDF"/>
+            </w:tcBorders>
+            <w:shd w:val="clear" w:color="auto" w:fill="FFFFFF"/>
+            <w:tcMar>
+              <w:top w:w="210" w:type="dxa"/>
+              <w:left w:w="210" w:type="dxa"/>
+              <w:bottom w:w="210" w:type="dxa"/>
+              <w:right w:w="210" w:type="dxa"/>
+            </w:tcMar>
+            <w:vAlign w:val="center"/>
+            <w:hideMark/>
+          </w:tcPr>
+          <w:p>
+            <w:r>
+              <w:t>Dictionary key and label are in the correct format and retrieves 40 key-value pairs. e.g:- {'Poodle_07956.jpg': ['poodle'], 'fox_squirrel_01.jpg': ['fox squirrel'] ... }</w:t>
+            </w:r>
+          </w:p>
+        </w:tc>
+      </w:tr>
+      <w:tr>
+        <w:tc>
+          <w:tcPr>
+            <w:tcW w:w="8993" w:type="dxa"/>
+            <w:tcBorders>
+              <w:top w:val="single" w:sz="2" w:space="0" w:color="DFDFDF"/>
+              <w:left w:val="single" w:sz="2" w:space="0" w:color="DFDFDF"/>
+              <w:bottom w:val="single" w:sz="4" w:space="0" w:color="DFDFDF"/>
+              <w:right w:val="single" w:sz="6" w:space="0" w:color="DFDFDF"/>
+            </w:tcBorders>
+            <w:shd w:val="clear" w:color="auto" w:fill="FFFFFF"/>
+            <w:tcMar>
+              <w:top w:w="210" w:type="dxa"/>
+              <w:left w:w="210" w:type="dxa"/>
+              <w:bottom w:w="210" w:type="dxa"/>
+              <w:right w:w="210" w:type="dxa"/>
+            </w:tcMar>
+            <w:vAlign w:val="center"/>
+            <w:hideMark/>
+          </w:tcPr>
+          <w:p>
+            <w:r>
+              <w:t>Correct Function Call</w:t>
+            </w:r>
+          </w:p>
+        </w:tc>
+        <w:tc>
+          <w:tcPr>
+            <w:tcW w:w="8993" w:type="dxa"/>
+            <w:tcBorders>
+              <w:top w:val="single" w:sz="2" w:space="0" w:color="DFDFDF"/>
+              <w:left w:val="single" w:sz="2" w:space="0" w:color="DFDFDF"/>
+              <w:bottom w:val="single" w:sz="4" w:space="0" w:color="DFDFDF"/>
+              <w:right w:val="single" w:sz="2" w:space="0" w:color="DFDFDF"/>
+            </w:tcBorders>
+            <w:shd w:val="clear" w:color="auto" w:fill="FFFFFF"/>
+            <w:tcMar>
+              <w:top w:w="210" w:type="dxa"/>
+              <w:left w:w="210" w:type="dxa"/>
+              <w:bottom w:w="210" w:type="dxa"/>
+              <w:right w:w="210" w:type="dxa"/>
+            </w:tcMar>
+            <w:vAlign w:val="center"/>
+            <w:hideMark/>
+          </w:tcPr>
+          <w:p>
+            <w:r>
+              <w:t>'in_arg.dir' is passed as an argument inside check_images.py while calling the get_pet_labels function.</w:t>
+            </w:r>
+          </w:p>
+        </w:tc>
+      </w:tr>
+    </w:tbl>
+    <w:p>
+      <w:r>
+        <w:t>Classifying Images</w:t>
+      </w:r>
+    </w:p>
+    <w:tbl>
+      <w:tblPr>
+        <w:tblW w:w="5000" w:type="pct"/>
+        <w:tblBorders>
+          <w:top w:val="single" w:sz="6" w:space="0" w:color="DFDFDF"/>
+          <w:left w:val="single" w:sz="6" w:space="0" w:color="DFDFDF"/>
+          <w:bottom w:val="single" w:sz="6" w:space="0" w:color="DFDFDF"/>
+          <w:right w:val="single" w:sz="6" w:space="0" w:color="DFDFDF"/>
+        </w:tblBorders>
+        <w:tblCellMar>
+          <w:top w:w="15" w:type="dxa"/>
+          <w:left w:w="15" w:type="dxa"/>
+          <w:bottom w:w="15" w:type="dxa"/>
+          <w:right w:w="15" w:type="dxa"/>
+        </w:tblCellMar>
+        <w:tblLook w:val="04A0" w:firstRow="1" w:lastRow="0" w:firstColumn="1" w:lastColumn="0" w:noHBand="0" w:noVBand="1"/>
+      </w:tblPr>
+      <w:tblGrid>
+        <w:gridCol w:w="4023"/>
+        <w:gridCol w:w="5337"/>
+      </w:tblGrid>
+      <w:tr>
+        <w:trPr>
+          <w:tblHeader/>
+        </w:trPr>
+        <w:tc>
+          <w:tcPr>
+            <w:tcW w:w="8993" w:type="dxa"/>
+            <w:tcBorders>
+              <w:top w:val="nil"/>
+              <w:left w:val="nil"/>
+              <w:bottom w:val="nil"/>
+              <w:right w:val="single" w:sz="6" w:space="0" w:color="DFDFDF"/>
+            </w:tcBorders>
+            <w:shd w:val="clear" w:color="auto" w:fill="F0F5FF"/>
+            <w:tcMar>
+              <w:top w:w="210" w:type="dxa"/>
+              <w:left w:w="210" w:type="dxa"/>
+              <w:bottom w:w="210" w:type="dxa"/>
+              <w:right w:w="210" w:type="dxa"/>
+            </w:tcMar>
+            <w:vAlign w:val="center"/>
+            <w:hideMark/>
+          </w:tcPr>
+          <w:p>
+            <w:pPr>
+              <w:rPr>
+                <w:b/>
+                <w:bCs/>
+              </w:rPr>
+            </w:pPr>
+            <w:r>
+              <w:rPr>
+                <w:b/>
+                <w:bCs/>
+              </w:rPr>
+              <w:t>Criteria</w:t>
+            </w:r>
+          </w:p>
+        </w:tc>
+        <w:tc>
+          <w:tcPr>
+            <w:tcW w:w="8993" w:type="dxa"/>
+            <w:tcBorders>
+              <w:top w:val="nil"/>
+              <w:left w:val="nil"/>
+              <w:bottom w:val="nil"/>
+              <w:right w:val="nil"/>
+            </w:tcBorders>
+            <w:shd w:val="clear" w:color="auto" w:fill="F0F5FF"/>
+            <w:tcMar>
+              <w:top w:w="210" w:type="dxa"/>
+              <w:left w:w="210" w:type="dxa"/>
+              <w:bottom w:w="210" w:type="dxa"/>
+              <w:right w:w="210" w:type="dxa"/>
+            </w:tcMar>
+            <w:vAlign w:val="center"/>
+            <w:hideMark/>
+          </w:tcPr>
+          <w:p>
+            <w:pPr>
+              <w:rPr>
+                <w:b/>
+                <w:bCs/>
+              </w:rPr>
+            </w:pPr>
+            <w:r>
+              <w:rPr>
+                <w:b/>
+                <w:bCs/>
+              </w:rPr>
+              <w:t>Submission Requirements</w:t>
+            </w:r>
+          </w:p>
+        </w:tc>
+      </w:tr>
+      <w:tr>
+        <w:tc>
+          <w:tcPr>
+            <w:tcW w:w="8993" w:type="dxa"/>
+            <w:tcBorders>
+              <w:top w:val="single" w:sz="2" w:space="0" w:color="DFDFDF"/>
+              <w:left w:val="single" w:sz="2" w:space="0" w:color="DFDFDF"/>
+              <w:bottom w:val="single" w:sz="4" w:space="0" w:color="DFDFDF"/>
+              <w:right w:val="single" w:sz="6" w:space="0" w:color="DFDFDF"/>
+            </w:tcBorders>
+            <w:shd w:val="clear" w:color="auto" w:fill="FFFFFF"/>
+            <w:tcMar>
+              <w:top w:w="210" w:type="dxa"/>
+              <w:left w:w="210" w:type="dxa"/>
+              <w:bottom w:w="210" w:type="dxa"/>
+              <w:right w:w="210" w:type="dxa"/>
+            </w:tcMar>
+            <w:vAlign w:val="center"/>
+            <w:hideMark/>
+          </w:tcPr>
+          <w:p>
+            <w:r>
+              <w:t>Correct Function Call</w:t>
+            </w:r>
+          </w:p>
+        </w:tc>
+        <w:tc>
+          <w:tcPr>
+            <w:tcW w:w="8993" w:type="dxa"/>
+            <w:tcBorders>
+              <w:top w:val="single" w:sz="2" w:space="0" w:color="DFDFDF"/>
+              <w:left w:val="single" w:sz="2" w:space="0" w:color="DFDFDF"/>
+              <w:bottom w:val="single" w:sz="4" w:space="0" w:color="DFDFDF"/>
+              <w:right w:val="single" w:sz="2" w:space="0" w:color="DFDFDF"/>
+            </w:tcBorders>
+            <w:shd w:val="clear" w:color="auto" w:fill="FFFFFF"/>
+            <w:tcMar>
+              <w:top w:w="210" w:type="dxa"/>
+              <w:left w:w="210" w:type="dxa"/>
+              <w:bottom w:w="210" w:type="dxa"/>
+              <w:right w:w="210" w:type="dxa"/>
+            </w:tcMar>
+            <w:vAlign w:val="center"/>
+            <w:hideMark/>
+          </w:tcPr>
+          <w:p>
+            <w:r>
+              <w:t>Appends images_dir to each value before making the function call.</w:t>
+            </w:r>
+          </w:p>
+          <w:p>
+            <w:r>
+              <w:t>classifier(images_dir+users_key, model)</w:t>
+            </w:r>
+          </w:p>
+        </w:tc>
+      </w:tr>
+      <w:tr>
+        <w:tc>
+          <w:tcPr>
+            <w:tcW w:w="8993" w:type="dxa"/>
+            <w:tcBorders>
+              <w:top w:val="single" w:sz="2" w:space="0" w:color="DFDFDF"/>
+              <w:left w:val="single" w:sz="2" w:space="0" w:color="DFDFDF"/>
+              <w:bottom w:val="single" w:sz="4" w:space="0" w:color="DFDFDF"/>
+              <w:right w:val="single" w:sz="6" w:space="0" w:color="DFDFDF"/>
+            </w:tcBorders>
+            <w:shd w:val="clear" w:color="auto" w:fill="FFFFFF"/>
+            <w:tcMar>
+              <w:top w:w="210" w:type="dxa"/>
+              <w:left w:w="210" w:type="dxa"/>
+              <w:bottom w:w="210" w:type="dxa"/>
+              <w:right w:w="210" w:type="dxa"/>
+            </w:tcMar>
+            <w:vAlign w:val="center"/>
+            <w:hideMark/>
+          </w:tcPr>
+          <w:p>
+            <w:r>
+              <w:lastRenderedPageBreak/>
+              <w:t>Output Formatting</w:t>
+            </w:r>
+          </w:p>
+        </w:tc>
+        <w:tc>
+          <w:tcPr>
+            <w:tcW w:w="8993" w:type="dxa"/>
+            <w:tcBorders>
+              <w:top w:val="single" w:sz="2" w:space="0" w:color="DFDFDF"/>
+              <w:left w:val="single" w:sz="2" w:space="0" w:color="DFDFDF"/>
+              <w:bottom w:val="single" w:sz="4" w:space="0" w:color="DFDFDF"/>
+              <w:right w:val="single" w:sz="2" w:space="0" w:color="DFDFDF"/>
+            </w:tcBorders>
+            <w:shd w:val="clear" w:color="auto" w:fill="FFFFFF"/>
+            <w:tcMar>
+              <w:top w:w="210" w:type="dxa"/>
+              <w:left w:w="210" w:type="dxa"/>
+              <w:bottom w:w="210" w:type="dxa"/>
+              <w:right w:w="210" w:type="dxa"/>
+            </w:tcMar>
+            <w:vAlign w:val="center"/>
+            <w:hideMark/>
+          </w:tcPr>
+          <w:p>
+            <w:r>
+              <w:t>Convert the output to lower case and strip any whitespaces</w:t>
+            </w:r>
+          </w:p>
+        </w:tc>
+      </w:tr>
+      <w:tr>
+        <w:tc>
+          <w:tcPr>
+            <w:tcW w:w="8993" w:type="dxa"/>
+            <w:tcBorders>
+              <w:top w:val="single" w:sz="2" w:space="0" w:color="DFDFDF"/>
+              <w:left w:val="single" w:sz="2" w:space="0" w:color="DFDFDF"/>
+              <w:bottom w:val="single" w:sz="4" w:space="0" w:color="DFDFDF"/>
+              <w:right w:val="single" w:sz="6" w:space="0" w:color="DFDFDF"/>
+            </w:tcBorders>
+            <w:shd w:val="clear" w:color="auto" w:fill="FFFFFF"/>
+            <w:tcMar>
+              <w:top w:w="210" w:type="dxa"/>
+              <w:left w:w="210" w:type="dxa"/>
+              <w:bottom w:w="210" w:type="dxa"/>
+              <w:right w:w="210" w:type="dxa"/>
+            </w:tcMar>
+            <w:vAlign w:val="center"/>
+            <w:hideMark/>
+          </w:tcPr>
+          <w:p>
+            <w:r>
+              <w:t>Verifies and stores results in appropriate way. Displays output when the function call is made.</w:t>
+            </w:r>
+          </w:p>
+        </w:tc>
+        <w:tc>
+          <w:tcPr>
+            <w:tcW w:w="8993" w:type="dxa"/>
+            <w:tcBorders>
+              <w:top w:val="single" w:sz="2" w:space="0" w:color="DFDFDF"/>
+              <w:left w:val="single" w:sz="2" w:space="0" w:color="DFDFDF"/>
+              <w:bottom w:val="single" w:sz="4" w:space="0" w:color="DFDFDF"/>
+              <w:right w:val="single" w:sz="2" w:space="0" w:color="DFDFDF"/>
+            </w:tcBorders>
+            <w:shd w:val="clear" w:color="auto" w:fill="FFFFFF"/>
+            <w:tcMar>
+              <w:top w:w="210" w:type="dxa"/>
+              <w:left w:w="210" w:type="dxa"/>
+              <w:bottom w:w="210" w:type="dxa"/>
+              <w:right w:w="210" w:type="dxa"/>
+            </w:tcMar>
+            <w:vAlign w:val="center"/>
+            <w:hideMark/>
+          </w:tcPr>
+          <w:p>
+            <w:r>
+              <w:t>Appends 1 to correct label, and 0 to falsely classified values</w:t>
+            </w:r>
+          </w:p>
+        </w:tc>
+      </w:tr>
+    </w:tbl>
+    <w:p>
+      <w:r>
+        <w:t>Classifying Labels as Dogs</w:t>
+      </w:r>
+    </w:p>
+    <w:tbl>
+      <w:tblPr>
+        <w:tblW w:w="5000" w:type="pct"/>
+        <w:tblBorders>
+          <w:top w:val="single" w:sz="6" w:space="0" w:color="DFDFDF"/>
+          <w:left w:val="single" w:sz="6" w:space="0" w:color="DFDFDF"/>
+          <w:bottom w:val="single" w:sz="6" w:space="0" w:color="DFDFDF"/>
+          <w:right w:val="single" w:sz="6" w:space="0" w:color="DFDFDF"/>
+        </w:tblBorders>
+        <w:tblCellMar>
+          <w:top w:w="15" w:type="dxa"/>
+          <w:left w:w="15" w:type="dxa"/>
+          <w:bottom w:w="15" w:type="dxa"/>
+          <w:right w:w="15" w:type="dxa"/>
+        </w:tblCellMar>
+        <w:tblLook w:val="04A0" w:firstRow="1" w:lastRow="0" w:firstColumn="1" w:lastColumn="0" w:noHBand="0" w:noVBand="1"/>
+      </w:tblPr>
+      <w:tblGrid>
+        <w:gridCol w:w="4608"/>
+        <w:gridCol w:w="4752"/>
+      </w:tblGrid>
+      <w:tr>
+        <w:trPr>
+          <w:tblHeader/>
+        </w:trPr>
+        <w:tc>
+          <w:tcPr>
+            <w:tcW w:w="8993" w:type="dxa"/>
+            <w:tcBorders>
+              <w:top w:val="nil"/>
+              <w:left w:val="nil"/>
+              <w:bottom w:val="nil"/>
+              <w:right w:val="single" w:sz="6" w:space="0" w:color="DFDFDF"/>
+            </w:tcBorders>
+            <w:shd w:val="clear" w:color="auto" w:fill="F0F5FF"/>
+            <w:tcMar>
+              <w:top w:w="210" w:type="dxa"/>
+              <w:left w:w="210" w:type="dxa"/>
+              <w:bottom w:w="210" w:type="dxa"/>
+              <w:right w:w="210" w:type="dxa"/>
+            </w:tcMar>
+            <w:vAlign w:val="center"/>
+            <w:hideMark/>
+          </w:tcPr>
+          <w:p>
+            <w:pPr>
+              <w:rPr>
+                <w:b/>
+                <w:bCs/>
+              </w:rPr>
+            </w:pPr>
+            <w:r>
+              <w:rPr>
+                <w:b/>
+                <w:bCs/>
+              </w:rPr>
+              <w:t>Criteria</w:t>
+            </w:r>
+          </w:p>
+        </w:tc>
+        <w:tc>
+          <w:tcPr>
+            <w:tcW w:w="8993" w:type="dxa"/>
+            <w:tcBorders>
+              <w:top w:val="nil"/>
+              <w:left w:val="nil"/>
+              <w:bottom w:val="nil"/>
+              <w:right w:val="nil"/>
+            </w:tcBorders>
+            <w:shd w:val="clear" w:color="auto" w:fill="F0F5FF"/>
+            <w:tcMar>
+              <w:top w:w="210" w:type="dxa"/>
+              <w:left w:w="210" w:type="dxa"/>
+              <w:bottom w:w="210" w:type="dxa"/>
+              <w:right w:w="210" w:type="dxa"/>
+            </w:tcMar>
+            <w:vAlign w:val="center"/>
+            <w:hideMark/>
+          </w:tcPr>
+          <w:p>
+            <w:pPr>
+              <w:rPr>
+                <w:b/>
+                <w:bCs/>
+              </w:rPr>
+            </w:pPr>
+            <w:r>
+              <w:rPr>
+                <w:b/>
+                <w:bCs/>
+              </w:rPr>
+              <w:t>Submission Requirements</w:t>
+            </w:r>
+          </w:p>
+        </w:tc>
+      </w:tr>
+      <w:tr>
+        <w:tc>
+          <w:tcPr>
+            <w:tcW w:w="8993" w:type="dxa"/>
+            <w:tcBorders>
+              <w:top w:val="single" w:sz="2" w:space="0" w:color="DFDFDF"/>
+              <w:left w:val="single" w:sz="2" w:space="0" w:color="DFDFDF"/>
+              <w:bottom w:val="single" w:sz="4" w:space="0" w:color="DFDFDF"/>
+              <w:right w:val="single" w:sz="6" w:space="0" w:color="DFDFDF"/>
+            </w:tcBorders>
+            <w:shd w:val="clear" w:color="auto" w:fill="FFFFFF"/>
+            <w:tcMar>
+              <w:top w:w="210" w:type="dxa"/>
+              <w:left w:w="210" w:type="dxa"/>
+              <w:bottom w:w="210" w:type="dxa"/>
+              <w:right w:w="210" w:type="dxa"/>
+            </w:tcMar>
+            <w:vAlign w:val="center"/>
+            <w:hideMark/>
+          </w:tcPr>
+          <w:p>
+            <w:r>
+              <w:t>Matches between Classifier and Pet Image Labels have both labels classified as "dogs" or "not dogs" as appropriate for the labels.</w:t>
+            </w:r>
+          </w:p>
+        </w:tc>
+        <w:tc>
+          <w:tcPr>
+            <w:tcW w:w="8993" w:type="dxa"/>
+            <w:tcBorders>
+              <w:top w:val="single" w:sz="2" w:space="0" w:color="DFDFDF"/>
+              <w:left w:val="single" w:sz="2" w:space="0" w:color="DFDFDF"/>
+              <w:bottom w:val="single" w:sz="4" w:space="0" w:color="DFDFDF"/>
+              <w:right w:val="single" w:sz="2" w:space="0" w:color="DFDFDF"/>
+            </w:tcBorders>
+            <w:shd w:val="clear" w:color="auto" w:fill="FFFFFF"/>
+            <w:tcMar>
+              <w:top w:w="210" w:type="dxa"/>
+              <w:left w:w="210" w:type="dxa"/>
+              <w:bottom w:w="210" w:type="dxa"/>
+              <w:right w:w="210" w:type="dxa"/>
+            </w:tcMar>
+            <w:vAlign w:val="center"/>
+            <w:hideMark/>
+          </w:tcPr>
+          <w:p>
+            <w:r>
+              <w:t>Check the displayed output and see if all matches are appropriately displayed.</w:t>
+            </w:r>
+          </w:p>
+        </w:tc>
+      </w:tr>
+      <w:tr>
+        <w:tc>
+          <w:tcPr>
+            <w:tcW w:w="8993" w:type="dxa"/>
+            <w:tcBorders>
+              <w:top w:val="single" w:sz="2" w:space="0" w:color="DFDFDF"/>
+              <w:left w:val="single" w:sz="2" w:space="0" w:color="DFDFDF"/>
+              <w:bottom w:val="single" w:sz="4" w:space="0" w:color="DFDFDF"/>
+              <w:right w:val="single" w:sz="6" w:space="0" w:color="DFDFDF"/>
+            </w:tcBorders>
+            <w:shd w:val="clear" w:color="auto" w:fill="FFFFFF"/>
+            <w:tcMar>
+              <w:top w:w="210" w:type="dxa"/>
+              <w:left w:w="210" w:type="dxa"/>
+              <w:bottom w:w="210" w:type="dxa"/>
+              <w:right w:w="210" w:type="dxa"/>
+            </w:tcMar>
+            <w:vAlign w:val="center"/>
+            <w:hideMark/>
+          </w:tcPr>
+          <w:p>
+            <w:r>
+              <w:t>Non-matches between Classifier and Pet Image Labels correctly classify each label as "dogs" or "not dogs"</w:t>
+            </w:r>
+          </w:p>
+        </w:tc>
+        <w:tc>
+          <w:tcPr>
+            <w:tcW w:w="8993" w:type="dxa"/>
+            <w:tcBorders>
+              <w:top w:val="single" w:sz="2" w:space="0" w:color="DFDFDF"/>
+              <w:left w:val="single" w:sz="2" w:space="0" w:color="DFDFDF"/>
+              <w:bottom w:val="single" w:sz="4" w:space="0" w:color="DFDFDF"/>
+              <w:right w:val="single" w:sz="2" w:space="0" w:color="DFDFDF"/>
+            </w:tcBorders>
+            <w:shd w:val="clear" w:color="auto" w:fill="FFFFFF"/>
+            <w:tcMar>
+              <w:top w:w="210" w:type="dxa"/>
+              <w:left w:w="210" w:type="dxa"/>
+              <w:bottom w:w="210" w:type="dxa"/>
+              <w:right w:w="210" w:type="dxa"/>
+            </w:tcMar>
+            <w:vAlign w:val="center"/>
+            <w:hideMark/>
+          </w:tcPr>
+          <w:p>
+            <w:r>
+              <w:t>Check the displayed output and see if all non matches are appropriately displayed</w:t>
+            </w:r>
+          </w:p>
+        </w:tc>
+      </w:tr>
+    </w:tbl>
+    <w:p>
+      <w:r>
+        <w:t>Results</w:t>
+      </w:r>
+    </w:p>
+    <w:tbl>
+      <w:tblPr>
+        <w:tblW w:w="5000" w:type="pct"/>
+        <w:tblBorders>
+          <w:top w:val="single" w:sz="6" w:space="0" w:color="DFDFDF"/>
+          <w:left w:val="single" w:sz="6" w:space="0" w:color="DFDFDF"/>
+          <w:bottom w:val="single" w:sz="6" w:space="0" w:color="DFDFDF"/>
+          <w:right w:val="single" w:sz="6" w:space="0" w:color="DFDFDF"/>
+        </w:tblBorders>
+        <w:tblCellMar>
+          <w:top w:w="15" w:type="dxa"/>
+          <w:left w:w="15" w:type="dxa"/>
+          <w:bottom w:w="15" w:type="dxa"/>
+          <w:right w:w="15" w:type="dxa"/>
+        </w:tblCellMar>
+        <w:tblLook w:val="04A0" w:firstRow="1" w:lastRow="0" w:firstColumn="1" w:lastColumn="0" w:noHBand="0" w:noVBand="1"/>
+      </w:tblPr>
+      <w:tblGrid>
+        <w:gridCol w:w="4907"/>
+        <w:gridCol w:w="4453"/>
+      </w:tblGrid>
+      <w:tr>
+        <w:trPr>
+          <w:tblHeader/>
+        </w:trPr>
+        <w:tc>
+          <w:tcPr>
+            <w:tcW w:w="8993" w:type="dxa"/>
+            <w:tcBorders>
+              <w:top w:val="nil"/>
+              <w:left w:val="nil"/>
+              <w:bottom w:val="nil"/>
+              <w:right w:val="single" w:sz="6" w:space="0" w:color="DFDFDF"/>
+            </w:tcBorders>
+            <w:shd w:val="clear" w:color="auto" w:fill="F0F5FF"/>
+            <w:tcMar>
+              <w:top w:w="210" w:type="dxa"/>
+              <w:left w:w="210" w:type="dxa"/>
+              <w:bottom w:w="210" w:type="dxa"/>
+              <w:right w:w="210" w:type="dxa"/>
+            </w:tcMar>
+            <w:vAlign w:val="center"/>
+            <w:hideMark/>
+          </w:tcPr>
+          <w:p>
+            <w:pPr>
+              <w:rPr>
+                <w:b/>
+                <w:bCs/>
+              </w:rPr>
+            </w:pPr>
+            <w:r>
+              <w:rPr>
+                <w:b/>
+                <w:bCs/>
+              </w:rPr>
+              <w:t>Criteria</w:t>
+            </w:r>
+          </w:p>
+        </w:tc>
+        <w:tc>
+          <w:tcPr>
+            <w:tcW w:w="8993" w:type="dxa"/>
+            <w:tcBorders>
+              <w:top w:val="nil"/>
+              <w:left w:val="nil"/>
+              <w:bottom w:val="nil"/>
+              <w:right w:val="nil"/>
+            </w:tcBorders>
+            <w:shd w:val="clear" w:color="auto" w:fill="F0F5FF"/>
+            <w:tcMar>
+              <w:top w:w="210" w:type="dxa"/>
+              <w:left w:w="210" w:type="dxa"/>
+              <w:bottom w:w="210" w:type="dxa"/>
+              <w:right w:w="210" w:type="dxa"/>
+            </w:tcMar>
+            <w:vAlign w:val="center"/>
+            <w:hideMark/>
+          </w:tcPr>
+          <w:p>
+            <w:pPr>
+              <w:rPr>
+                <w:b/>
+                <w:bCs/>
+              </w:rPr>
+            </w:pPr>
+            <w:r>
+              <w:rPr>
+                <w:b/>
+                <w:bCs/>
+              </w:rPr>
+              <w:t>Submission Requirements</w:t>
+            </w:r>
+          </w:p>
+        </w:tc>
+      </w:tr>
+      <w:tr>
+        <w:tc>
+          <w:tcPr>
+            <w:tcW w:w="8993" w:type="dxa"/>
+            <w:tcBorders>
+              <w:top w:val="single" w:sz="2" w:space="0" w:color="DFDFDF"/>
+              <w:left w:val="single" w:sz="2" w:space="0" w:color="DFDFDF"/>
+              <w:bottom w:val="single" w:sz="4" w:space="0" w:color="DFDFDF"/>
+              <w:right w:val="single" w:sz="6" w:space="0" w:color="DFDFDF"/>
+            </w:tcBorders>
+            <w:shd w:val="clear" w:color="auto" w:fill="FFFFFF"/>
+            <w:tcMar>
+              <w:top w:w="210" w:type="dxa"/>
+              <w:left w:w="210" w:type="dxa"/>
+              <w:bottom w:w="210" w:type="dxa"/>
+              <w:right w:w="210" w:type="dxa"/>
+            </w:tcMar>
+            <w:vAlign w:val="center"/>
+            <w:hideMark/>
+          </w:tcPr>
+          <w:p>
+            <w:r>
+              <w:t>Accurate overall scores for three models by running run_models_batch.sh after writing all the code.</w:t>
+            </w:r>
+          </w:p>
+        </w:tc>
+        <w:tc>
+          <w:tcPr>
+            <w:tcW w:w="8993" w:type="dxa"/>
+            <w:tcBorders>
+              <w:top w:val="single" w:sz="2" w:space="0" w:color="DFDFDF"/>
+              <w:left w:val="single" w:sz="2" w:space="0" w:color="DFDFDF"/>
+              <w:bottom w:val="single" w:sz="4" w:space="0" w:color="DFDFDF"/>
+              <w:right w:val="single" w:sz="2" w:space="0" w:color="DFDFDF"/>
+            </w:tcBorders>
+            <w:shd w:val="clear" w:color="auto" w:fill="FFFFFF"/>
+            <w:tcMar>
+              <w:top w:w="210" w:type="dxa"/>
+              <w:left w:w="210" w:type="dxa"/>
+              <w:bottom w:w="210" w:type="dxa"/>
+              <w:right w:w="210" w:type="dxa"/>
+            </w:tcMar>
+            <w:vAlign w:val="center"/>
+            <w:hideMark/>
+          </w:tcPr>
+          <w:p>
+            <w:r>
+              <w:t>All three models score as expected.</w:t>
+            </w:r>
+          </w:p>
+        </w:tc>
+      </w:tr>
+    </w:tbl>
     <w:p/>
     <w:sectPr>
       <w:pgSz w:w="12240" w:h="15840"/>

</xml_diff>